<commit_message>
Add integration check, team-module docs and test-lock disclosure
- Code/check_integration.m: verifies Robin's feature sets against
  build_design.m and compares Aryan's HAR/Persistence with the main pipeline
  on development data (8/8 checks pass; results in
  Output/tables/integration_check.csv).
- README: team modules, how to run each, integration results, and a
  disclosure of the earlier test-period look at HAR and Persistence.
- Report: integration check and disclosure (Sections 10 and 11, Appendix B);
  docx and PDF rebuilt.

Co-Authored-By: Claude Opus 5.5 <noreply@anthropic.com>
</commit_message>
<xml_diff>
--- a/Report/RV_Forecasting_Report.docx
+++ b/Report/RV_Forecasting_Report.docx
@@ -27034,6 +27034,28 @@
     </w:p>
     <w:p>
       <w:pPr>
+        <w:pStyle w:val="Compact"/>
+        <w:numPr>
+          <w:ilvl w:val="0"/>
+          <w:numId w:val="1054"/>
+        </w:numPr>
+      </w:pPr>
+      <w:r>
+        <w:rPr>
+          <w:b/>
+          <w:bCs/>
+        </w:rPr>
+        <w:t xml:space="preserve">An early look at two benchmarks on the test period.</w:t>
+      </w:r>
+      <w:r>
+        <w:t xml:space="preserve"> </w:t>
+      </w:r>
+      <w:r>
+        <w:t xml:space="preserve">An earlier version of Aryan’s independent HAR script also scored HAR and Persistence on 2018–2026 (20 October 2026). Neither benchmark has tuning parameters, and no design choice in this report uses those numbers. The integrated script now follows the same test lock as the main pipeline, and its committed outputs cover development years only. We disclose this so the locked test can be read with it in mind.</w:t>
+      </w:r>
+    </w:p>
+    <w:p>
+      <w:pPr>
         <w:pStyle w:val="FirstParagraph"/>
       </w:pPr>
       <w:r>
@@ -27979,11 +28001,118 @@
           </w:p>
         </w:tc>
       </w:tr>
+      <w:tr>
+        <w:trPr>
+          <w:cantSplit/>
+        </w:trPr>
+        <w:tc>
+          <w:tcPr/>
+          <w:p>
+            <w:pPr>
+              <w:pStyle w:val="Compact"/>
+            </w:pPr>
+            <w:r>
+              <w:t xml:space="preserve">Team modules and integration check</w:t>
+            </w:r>
+          </w:p>
+        </w:tc>
+        <w:tc>
+          <w:tcPr/>
+          <w:p>
+            <w:pPr>
+              <w:pStyle w:val="Compact"/>
+            </w:pPr>
+            <w:r>
+              <w:rPr>
+                <w:rStyle w:val="VerbatimChar"/>
+              </w:rPr>
+              <w:t xml:space="preserve">Code/Robin/</w:t>
+            </w:r>
+            <w:r>
+              <w:t xml:space="preserve"> </w:t>
+            </w:r>
+            <w:r>
+              <w:t xml:space="preserve">(Robin: targets, aligned features, feature sets A–D as standalone files);</w:t>
+            </w:r>
+            <w:r>
+              <w:t xml:space="preserve"> </w:t>
+            </w:r>
+            <w:r>
+              <w:rPr>
+                <w:rStyle w:val="VerbatimChar"/>
+              </w:rPr>
+              <w:t xml:space="preserve">aryan/code/rv_har_pipeline.m</w:t>
+            </w:r>
+            <w:r>
+              <w:t xml:space="preserve"> </w:t>
+            </w:r>
+            <w:r>
+              <w:t xml:space="preserve">(Aryan: independent HAR vs Persistence with its own rules);</w:t>
+            </w:r>
+            <w:r>
+              <w:t xml:space="preserve"> </w:t>
+            </w:r>
+            <w:r>
+              <w:rPr>
+                <w:rStyle w:val="VerbatimChar"/>
+              </w:rPr>
+              <w:t xml:space="preserve">Code/check_integration.m</w:t>
+            </w:r>
+          </w:p>
+        </w:tc>
+      </w:tr>
     </w:tbl>
     <w:p>
       <w:pPr>
         <w:spacing w:before="0" w:after="0" w:line="120" w:lineRule="exact"/>
       </w:pPr>
+    </w:p>
+    <w:p>
+      <w:pPr>
+        <w:pStyle w:val="BodyText"/>
+      </w:pPr>
+      <w:r>
+        <w:rPr>
+          <w:b/>
+          <w:bCs/>
+        </w:rPr>
+        <w:t xml:space="preserve">Integration check (21 October 2026).</w:t>
+      </w:r>
+      <w:r>
+        <w:t xml:space="preserve"> </w:t>
+      </w:r>
+      <w:r>
+        <w:t xml:space="preserve">Robin’s standalone data preparation reproduces the main pipeline’s 46 features and three targets to within</w:t>
+      </w:r>
+      <w:r>
+        <w:t xml:space="preserve"> </w:t>
+      </w:r>
+      <m:oMath>
+        <m:sSup>
+          <m:e>
+            <m:r>
+              <m:t>10</m:t>
+            </m:r>
+          </m:e>
+          <m:sup>
+            <m:r>
+              <m:rPr>
+                <m:sty m:val="p"/>
+              </m:rPr>
+              <m:t>−</m:t>
+            </m:r>
+            <m:r>
+              <m:t>14</m:t>
+            </m:r>
+          </m:sup>
+        </m:sSup>
+      </m:oMath>
+      <w:r>
+        <w:t xml:space="preserve"> </w:t>
+      </w:r>
+      <w:r>
+        <w:t xml:space="preserve">for both targets. Aryan’s independent HAR and Persistence forecasts have correlations of 0.999–1.000 with the main pipeline’s on development data, and their HAR/Persistence QLIKE ratios differ by at most 0.01, even though his script uses its own missing-day, holiday and floor rules.</w:t>
+      </w:r>
     </w:p>
     <w:p>
       <w:pPr>
@@ -33532,7 +33661,7 @@
               <w:pStyle w:val="Compact"/>
             </w:pPr>
             <w:r>
-              <w:t xml:space="preserve">Pending</w:t>
+              <w:t xml:space="preserve">Pending (early benchmark look disclosed, Section 10)</w:t>
             </w:r>
           </w:p>
         </w:tc>

</xml_diff>